<commit_message>
Tighten pilot manual wording to exact audit-approved phrasing
Aligns the manual and changelog with the literal wording requested after
the evidence audit: adds the three required bullets to §4 Evidence /
Documentation Gaps, inserts the exact required New Booking Workflow
statement in §11, expands §24 Developer Notes into distinct, actionable
items (unified wizard flow chain, ramp-booking/quotation flow connection,
Prisma-vs-raw-Supabase decision, ENABLE_PRODUCTION_BOOKINGS documentation
requirements, formal per-patch changelog fields), and adds an explicit
"no verified Codex Task 05 changelog can be produced" statement to the
changelog that separates verified findings from unverified historical
claims. Updates the README "User Manuals" section to the requested
Version 07 labeling. Regenerated the .docx via docs/build_manual_docx.py.

Co-Authored-By: Claude Sonnet 5 <noreply@anthropic.com>
Claude-Session: https://claude.ai/code/session_01Mn6ZySxfVfLjYcQ1DjDm3R
</commit_message>
<xml_diff>
--- a/docs/07-fc-chief-engineer-pilot-manual.docx
+++ b/docs/07-fc-chief-engineer-pilot-manual.docx
@@ -830,6 +830,45 @@
           <w:sz w:val="22"/>
         </w:rPr>
         <w:t>Codex Task 05 evidence was not found — this is a documentation gap, not a software limitation.</w:t>
+      </w:r>
+    </w:p>
+    <w:p>
+      <w:pPr>
+        <w:pStyle w:val="ListBullet"/>
+      </w:pPr>
+      <w:r>
+        <w:rPr>
+          <w:rFonts w:ascii="Arial" w:hAnsi="Arial" w:eastAsia="Arial" w:cs="Arial"/>
+          <w:b w:val="0"/>
+          <w:sz w:val="22"/>
+        </w:rPr>
+        <w:t>ไม่พบหลักฐาน "Codex Task 05 Web App Development Patch September" ใน filename, content grep, git log, branch หรือ tag</w:t>
+      </w:r>
+    </w:p>
+    <w:p>
+      <w:pPr>
+        <w:pStyle w:val="ListBullet"/>
+      </w:pPr>
+      <w:r>
+        <w:rPr>
+          <w:rFonts w:ascii="Arial" w:hAnsi="Arial" w:eastAsia="Arial" w:cs="Arial"/>
+          <w:b w:val="0"/>
+          <w:sz w:val="22"/>
+        </w:rPr>
+        <w:t>คู่มือฉบับนี้จึงอ้างอิงจาก version 07 current repo/codebase, CLAUDE.md (ไม่พบ), audit result, และไฟล์ app ปัจจุบัน</w:t>
+      </w:r>
+    </w:p>
+    <w:p>
+      <w:pPr>
+        <w:pStyle w:val="ListBullet"/>
+      </w:pPr>
+      <w:r>
+        <w:rPr>
+          <w:rFonts w:ascii="Arial" w:hAnsi="Arial" w:eastAsia="Arial" w:cs="Arial"/>
+          <w:b w:val="0"/>
+          <w:sz w:val="22"/>
+        </w:rPr>
+        <w:t>ในอนาคตควรบันทึก patch/task ทุกครั้งในไฟล์ changelog ที่มี task number, patch name, date, branch, commit hash และ affected files (ดู §24 ข้อ 6)</w:t>
       </w:r>
     </w:p>
     <w:p>
@@ -3677,21 +3716,81 @@
       </w:r>
     </w:p>
     <w:p>
+      <w:pPr>
+        <w:ind w:left="567"/>
+      </w:pPr>
+      <w:r>
+        <w:rPr>
+          <w:rFonts w:ascii="Arial" w:hAnsi="Arial" w:eastAsia="Arial" w:cs="Arial"/>
+          <w:b w:val="0"/>
+          <w:i/>
+          <w:sz w:val="22"/>
+        </w:rPr>
+        <w:t xml:space="preserve">ระบบปัจจุบันยังไม่มี Unified New Booking Wizard แบบหน้าจอเดียวที่รวม operation/tide + service/price เข้าด้วยกัน  </w:t>
+      </w:r>
       <w:r>
         <w:rPr>
           <w:rFonts w:ascii="Arial" w:hAnsi="Arial" w:eastAsia="Arial" w:cs="Arial"/>
           <w:b/>
-          <w:sz w:val="22"/>
-        </w:rPr>
-        <w:t>ระบบยังไม่มี Unified New Booking Wizard แบบฟอร์มเดียว</w:t>
+          <w:i/>
+          <w:sz w:val="22"/>
+        </w:rPr>
+        <w:t>Current verified flows:</w:t>
       </w:r>
       <w:r>
         <w:rPr>
           <w:rFonts w:ascii="Arial" w:hAnsi="Arial" w:eastAsia="Arial" w:cs="Arial"/>
           <w:b w:val="0"/>
-          <w:sz w:val="22"/>
-        </w:rPr>
-        <w:t xml:space="preserve"> ที่ยืนยันแล้วจากการตรวจสอบโค้ดจริง มี </w:t>
+          <w:i/>
+          <w:sz w:val="22"/>
+        </w:rPr>
+        <w:t xml:space="preserve"> - </w:t>
+      </w:r>
+      <w:r>
+        <w:rPr>
+          <w:rFonts w:ascii="Arial" w:hAnsi="Arial" w:eastAsia="Arial" w:cs="Arial"/>
+          <w:b/>
+          <w:i/>
+          <w:sz w:val="22"/>
+        </w:rPr>
+        <w:t>ramp-bookings/new:</w:t>
+      </w:r>
+      <w:r>
+        <w:rPr>
+          <w:rFonts w:ascii="Arial" w:hAnsi="Arial" w:eastAsia="Arial" w:cs="Arial"/>
+          <w:b w:val="0"/>
+          <w:i/>
+          <w:sz w:val="22"/>
+        </w:rPr>
+        <w:t xml:space="preserve"> ใช้สำหรับ operation และ tide workflow แต่ไม่มี service/price selection - </w:t>
+      </w:r>
+      <w:r>
+        <w:rPr>
+          <w:rFonts w:ascii="Arial" w:hAnsi="Arial" w:eastAsia="Arial" w:cs="Arial"/>
+          <w:b/>
+          <w:i/>
+          <w:sz w:val="22"/>
+        </w:rPr>
+        <w:t>quotations/new:</w:t>
+      </w:r>
+      <w:r>
+        <w:rPr>
+          <w:rFonts w:ascii="Arial" w:hAnsi="Arial" w:eastAsia="Arial" w:cs="Arial"/>
+          <w:b w:val="0"/>
+          <w:i/>
+          <w:sz w:val="22"/>
+        </w:rPr>
+        <w:t xml:space="preserve"> ใช้สำหรับ multi-service และ price calculation แต่ไม่มี tide workflow  ทั้งสอง flow ยังไม่เชื่อมกันเป็น booking-to-quotation-to-invoice workflow เดียว</w:t>
+      </w:r>
+    </w:p>
+    <w:p>
+      <w:r>
+        <w:rPr>
+          <w:rFonts w:ascii="Arial" w:hAnsi="Arial" w:eastAsia="Arial" w:cs="Arial"/>
+          <w:b w:val="0"/>
+          <w:sz w:val="22"/>
+        </w:rPr>
+        <w:t xml:space="preserve">รายละเอียดเพิ่มเติมที่ยืนยันแล้วจากการตรวจสอบโค้ดจริง มี </w:t>
       </w:r>
       <w:r>
         <w:rPr>
@@ -7742,10 +7841,18 @@
       <w:r>
         <w:rPr>
           <w:rFonts w:ascii="Arial" w:hAnsi="Arial" w:eastAsia="Arial" w:cs="Arial"/>
+          <w:b/>
+          <w:sz w:val="22"/>
+        </w:rPr>
+        <w:t>สร้าง Unified New Booking Wizard</w:t>
+      </w:r>
+      <w:r>
+        <w:rPr>
+          <w:rFonts w:ascii="Arial" w:hAnsi="Arial" w:eastAsia="Arial" w:cs="Arial"/>
           <w:b w:val="0"/>
           <w:sz w:val="22"/>
         </w:rPr>
-        <w:t>พิจารณาสร้างฟอร์มการจองแบบรวมศูนย์เดียว (Unified New Booking Wizard) ที่รวม vessel info, truck/lift selection, multi-service, price summary ตามที่ทีมปฏิบัติการต้องการ</w:t>
+        <w:t xml:space="preserve"> ที่เชื่อมขั้นตอนต่อไปนี้เข้าด้วยกันเป็นหน้าเดียว: vessel info → slot selection → tide check → truck/lift selection → multi-service selection → price summary → save/confirm</w:t>
       </w:r>
     </w:p>
     <w:p>
@@ -7755,10 +7862,18 @@
       <w:r>
         <w:rPr>
           <w:rFonts w:ascii="Arial" w:hAnsi="Arial" w:eastAsia="Arial" w:cs="Arial"/>
+          <w:b/>
+          <w:sz w:val="22"/>
+        </w:rPr>
+        <w:t>เชื่อมต่อ flow ระหว่าง ramp booking และ quotation</w:t>
+      </w:r>
+      <w:r>
+        <w:rPr>
+          <w:rFonts w:ascii="Arial" w:hAnsi="Arial" w:eastAsia="Arial" w:cs="Arial"/>
           <w:b w:val="0"/>
           <w:sz w:val="22"/>
         </w:rPr>
-        <w:t>เพิ่มฟิลด์ `gl_code` ที่เป็นโครงสร้างจริงใน `PricingMaster` model แทนการฝังในข้อความหมายเหตุ เพื่อให้ FC ค้นหา/ตรวจสอบได้อัตโนมัติ</w:t>
+        <w:t xml:space="preserve"> ให้เป็น operational workflow เดียวกัน (ปัจจุบันทั้งสอง flow แยกกันโดยสิ้นเชิง ไม่มีการอ้างอิงข้าม API — ดู §11, §23)</w:t>
       </w:r>
     </w:p>
     <w:p>
@@ -7768,10 +7883,18 @@
       <w:r>
         <w:rPr>
           <w:rFonts w:ascii="Arial" w:hAnsi="Arial" w:eastAsia="Arial" w:cs="Arial"/>
+          <w:b/>
+          <w:sz w:val="22"/>
+        </w:rPr>
+        <w:t>ตัดสินใจสถาปัตยกรรมข้อมูล:</w:t>
+      </w:r>
+      <w:r>
+        <w:rPr>
+          <w:rFonts w:ascii="Arial" w:hAnsi="Arial" w:eastAsia="Arial" w:cs="Arial"/>
           <w:b w:val="0"/>
           <w:sz w:val="22"/>
         </w:rPr>
-        <w:t>ยืนยันและบันทึกเป็นลายลักษณ์อักษรว่า speedboat haul-out เป็นราคาเหมาจ่ายหรือไม่ (ปัจจุบันไม่มีหลักฐาน) เพื่อป้องกันความสับสนในการออกใบเสนอราคา</w:t>
+        <w:t xml:space="preserve"> ควรย้าย ramp booking (`mms_ramp_bookings`) เข้าสู่ Prisma schema หรือคงไว้เป็น raw Supabase access ต่อไป — หากคงไว้ ต้องกำหนดขอบเขต repository/service ให้ชัดเจนเพื่อไม่ให้ data layer กระจัดกระจาย</w:t>
       </w:r>
     </w:p>
     <w:p>
@@ -7781,10 +7904,18 @@
       <w:r>
         <w:rPr>
           <w:rFonts w:ascii="Arial" w:hAnsi="Arial" w:eastAsia="Arial" w:cs="Arial"/>
+          <w:b/>
+          <w:sz w:val="22"/>
+        </w:rPr>
+        <w:t>เพิ่ม Prisma model สำหรับ `mms_ramp_bookings`</w:t>
+      </w:r>
+      <w:r>
+        <w:rPr>
+          <w:rFonts w:ascii="Arial" w:hAnsi="Arial" w:eastAsia="Arial" w:cs="Arial"/>
           <w:b w:val="0"/>
           <w:sz w:val="22"/>
         </w:rPr>
-        <w:t>ตรวจสอบและยืนยันกลไกการทำงานจริงของ Recurring Billing ให้ครบวงจร</w:t>
+        <w:t xml:space="preserve"> หากทีมยึดมาตรฐาน Prisma-first สำหรับทุกตาราง (สอดคล้องกับข้อ 3)</w:t>
       </w:r>
     </w:p>
     <w:p>
@@ -7794,10 +7925,18 @@
       <w:r>
         <w:rPr>
           <w:rFonts w:ascii="Arial" w:hAnsi="Arial" w:eastAsia="Arial" w:cs="Arial"/>
+          <w:b/>
+          <w:sz w:val="22"/>
+        </w:rPr>
+        <w:t>จัดทำเอกสาร `ENABLE_PRODUCTION_BOOKINGS` ให้ชัดเจน</w:t>
+      </w:r>
+      <w:r>
+        <w:rPr>
+          <w:rFonts w:ascii="Arial" w:hAnsi="Arial" w:eastAsia="Arial" w:cs="Arial"/>
           <w:b w:val="0"/>
           <w:sz w:val="22"/>
         </w:rPr>
-        <w:t>บันทึก patch/task รอบถัดไปในไฟล์ changelog รูปแบบเดียวกันเสมอ — ระบุหมายเลข task, ชื่อ patch, วันที่, ชื่อ branch, commit hash และไฟล์ที่ได้รับผลกระทบ เพื่อป้องกันปัญหาแบบ "Codex Task 05" ที่ตรวจสอบย้อนหลังไม่ได้ (ดู §4)</w:t>
+        <w:t xml:space="preserve"> ครอบคลุม: วัตถุประสงค์ของ flag, พฤติกรรมเริ่มต้น (default = ปิด/fail-closed), พฤติกรรมบน staging, พฤติกรรมบน production, และเหตุผลด้านความปลอดภัยที่ต้อง fail-closed แทนที่จะ fail-open</w:t>
       </w:r>
     </w:p>
     <w:p>
@@ -7807,10 +7946,18 @@
       <w:r>
         <w:rPr>
           <w:rFonts w:ascii="Arial" w:hAnsi="Arial" w:eastAsia="Arial" w:cs="Arial"/>
+          <w:b/>
+          <w:sz w:val="22"/>
+        </w:rPr>
+        <w:t>สร้างไฟล์ changelog ที่เป็นทางการสำหรับทุก patch ของ Codex/Claude ในอนาคต</w:t>
+      </w:r>
+      <w:r>
+        <w:rPr>
+          <w:rFonts w:ascii="Arial" w:hAnsi="Arial" w:eastAsia="Arial" w:cs="Arial"/>
           <w:b w:val="0"/>
           <w:sz w:val="22"/>
         </w:rPr>
-        <w:t>เพิ่มเอกสารอ้างอิงจำนวนช่องจอดสูงสุดต่อโซน (C/W/B/WB) ให้ชัดเจนในระดับ config หรือ schema</w:t>
+        <w:t xml:space="preserve"> โดยระบุ: หมายเลข task, วันที่, ชื่อ branch, commit hash, ไฟล์ที่เปลี่ยนแปลง, ผลกระทบต่อฟีเจอร์ (feature impact), และผลกระทบต่อข้อจำกัด (limitation impact) — เพื่อป้องกันปัญหาแบบ "Codex Task 05" ที่ตรวจสอบย้อนหลังไม่ได้ (ดู §4)</w:t>
       </w:r>
     </w:p>
     <w:p>
@@ -7823,7 +7970,46 @@
           <w:b w:val="0"/>
           <w:sz w:val="22"/>
         </w:rPr>
-        <w:t>พิจารณาย้ายตาราง `mms_ramp_bookings` เข้าสู่ Prisma model เพื่อรวม data layer กับ quotations/invoices ให้เป็นหนึ่งเดียว และทำเอกสาร `ENABLE_PRODUCTION_BOOKINGS` ให้ชัดเจนสำหรับทีม deploy staging/production</w:t>
+        <w:t>เพิ่มฟิลด์ `gl_code` ที่เป็นโครงสร้างจริงใน `PricingMaster` model แทนการฝังในข้อความหมายเหตุ เพื่อให้ FC ค้นหา/ตรวจสอบได้อัตโนมัติ</w:t>
+      </w:r>
+    </w:p>
+    <w:p>
+      <w:pPr>
+        <w:pStyle w:val="ListNumber"/>
+      </w:pPr>
+      <w:r>
+        <w:rPr>
+          <w:rFonts w:ascii="Arial" w:hAnsi="Arial" w:eastAsia="Arial" w:cs="Arial"/>
+          <w:b w:val="0"/>
+          <w:sz w:val="22"/>
+        </w:rPr>
+        <w:t>ยืนยันและบันทึกเป็นลายลักษณ์อักษรว่า speedboat haul-out เป็นราคาเหมาจ่ายหรือไม่ (ปัจจุบันไม่มีหลักฐาน) เพื่อป้องกันความสับสนในการออกใบเสนอราคา</w:t>
+      </w:r>
+    </w:p>
+    <w:p>
+      <w:pPr>
+        <w:pStyle w:val="ListNumber"/>
+      </w:pPr>
+      <w:r>
+        <w:rPr>
+          <w:rFonts w:ascii="Arial" w:hAnsi="Arial" w:eastAsia="Arial" w:cs="Arial"/>
+          <w:b w:val="0"/>
+          <w:sz w:val="22"/>
+        </w:rPr>
+        <w:t>ตรวจสอบและยืนยันกลไกการทำงานจริงของ Recurring Billing ให้ครบวงจร</w:t>
+      </w:r>
+    </w:p>
+    <w:p>
+      <w:pPr>
+        <w:pStyle w:val="ListNumber"/>
+      </w:pPr>
+      <w:r>
+        <w:rPr>
+          <w:rFonts w:ascii="Arial" w:hAnsi="Arial" w:eastAsia="Arial" w:cs="Arial"/>
+          <w:b w:val="0"/>
+          <w:sz w:val="22"/>
+        </w:rPr>
+        <w:t>เพิ่มเอกสารอ้างอิงจำนวนช่องจอดสูงสุดต่อโซน (C/W/B/WB) ให้ชัดเจนในระดับ config หรือ schema</w:t>
       </w:r>
     </w:p>
     <w:p>

</xml_diff>